<commit_message>
ICT batch updates: lesson arc prompt structure, export & UI resiliency, and run outputs
- Update section document & storyboard prompts to enforce a 3-part teaching arc (welcome & introduction, core teaching with examples, summary & conclusion).
- batchIct: add --missing-only, --skip-non-teaching, retry attempts per section, draft reuse on export failure, and configurable --max-failures.
- UI & export reliability:
  - Add robust view mode button handling and fallback click evaluation for Google Vids menubar.
  - Add fallback Enter/click handling for Drive @ picker document attachment.
  - Enhance Drive upload New button discovery and file upload menu item waiting.
  - Improve browser and Drive UI exporters with retry loops and evaluate click fallbacks.
  - Support --no-drive flag in export mode resolution.
- open-chrome-for-login: target dedicated Chrome profile directory.
- Update and add section source documents, coverage reports, outlines, batch run logs, and diagnostic traces.
</commit_message>
<xml_diff>
--- a/output/section-docs/ICT_G11_U01_S05_section_source.docx
+++ b/output/section-docs/ICT_G11_U01_S05_section_source.docx
@@ -19,7 +19,8 @@
           <w:b w:val="false"/>
           <w:bCs w:val="false"/>
         </w:rPr>
-        <w:t xml:space="preserve">Grade 11 ICT (Ethiopian curriculum). Textbook sub-chapter: Unit 1: 1.1, 1.2, 1.3, 1.4.</w:t>
+        <w:t xml:space="preserve">Grade 11 ICT (Ethiopian curriculum). Textbook sub-chapter: 1.2 Introduction to Information Systems.
+Structure: 1. Welcome &amp; Introduction to the section • 2. Core concept teaching &amp; examples • 3. Summary &amp; section conclusion.</w:t>
       </w:r>
     </w:p>
     <w:p>
@@ -40,43 +41,55 @@
           <w:b w:val="false"/>
           <w:bCs w:val="false"/>
         </w:rPr>
-        <w:t xml:space="preserve">• Data, Information, Knowledge, and Wisdom</w:t>
-      </w:r>
-    </w:p>
-    <w:p>
-      <w:pPr>
-        <w:spacing w:after="80"/>
-      </w:pPr>
-      <w:r>
-        <w:rPr>
-          <w:b w:val="false"/>
-          <w:bCs w:val="false"/>
-        </w:rPr>
-        <w:t xml:space="preserve">• Introduction to Information Systems</w:t>
-      </w:r>
-    </w:p>
-    <w:p>
-      <w:pPr>
-        <w:spacing w:after="80"/>
-      </w:pPr>
-      <w:r>
-        <w:rPr>
-          <w:b w:val="false"/>
-          <w:bCs w:val="false"/>
-        </w:rPr>
-        <w:t xml:space="preserve">• Applications of Information System</w:t>
-      </w:r>
-    </w:p>
-    <w:p>
-      <w:pPr>
-        <w:spacing w:after="80"/>
-      </w:pPr>
-      <w:r>
-        <w:rPr>
-          <w:b w:val="false"/>
-          <w:bCs w:val="false"/>
-        </w:rPr>
-        <w:t xml:space="preserve">• IT for Entrepreneurship</w:t>
+        <w:t xml:space="preserve">• Information systems</w:t>
+      </w:r>
+    </w:p>
+    <w:p>
+      <w:pPr>
+        <w:spacing w:after="80"/>
+      </w:pPr>
+      <w:r>
+        <w:rPr>
+          <w:b w:val="false"/>
+          <w:bCs w:val="false"/>
+        </w:rPr>
+        <w:t xml:space="preserve">• Components of IS</w:t>
+      </w:r>
+    </w:p>
+    <w:p>
+      <w:pPr>
+        <w:spacing w:after="80"/>
+      </w:pPr>
+      <w:r>
+        <w:rPr>
+          <w:b w:val="false"/>
+          <w:bCs w:val="false"/>
+        </w:rPr>
+        <w:t xml:space="preserve">• Time and attendance software</w:t>
+      </w:r>
+    </w:p>
+    <w:p>
+      <w:pPr>
+        <w:spacing w:after="80"/>
+      </w:pPr>
+      <w:r>
+        <w:rPr>
+          <w:b w:val="false"/>
+          <w:bCs w:val="false"/>
+        </w:rPr>
+        <w:t xml:space="preserve">• Performance management software</w:t>
+      </w:r>
+    </w:p>
+    <w:p>
+      <w:pPr>
+        <w:spacing w:after="80"/>
+      </w:pPr>
+      <w:r>
+        <w:rPr>
+          <w:b w:val="false"/>
+          <w:bCs w:val="false"/>
+        </w:rPr>
+        <w:t xml:space="preserve">• Training and development software</w:t>
       </w:r>
     </w:p>
     <w:p>
@@ -478,91 +491,1279 @@
           <w:b w:val="false"/>
           <w:bCs w:val="false"/>
         </w:rPr>
-        <w:t xml:space="preserve">1.1 Data, Information, Knowledge, and Wisdom</w:t>
-      </w:r>
-    </w:p>
-    <w:p>
-      <w:pPr>
-        <w:spacing w:after="80"/>
-      </w:pPr>
-      <w:r>
-        <w:rPr>
-          <w:b w:val="false"/>
-          <w:bCs w:val="false"/>
-        </w:rPr>
-        <w:t xml:space="preserve">Brainstorming 1.1  Reflect on the value of information in our daily life. 1 UNIT INFORMATION SYSTEMS AND ITS APPLICATIONS ## Page 7</w:t>
-      </w:r>
-    </w:p>
-    <w:p>
-      <w:pPr>
-        <w:spacing w:after="80"/>
-      </w:pPr>
-      <w:r>
-        <w:rPr>
-          <w:b w:val="false"/>
-          <w:bCs w:val="false"/>
-        </w:rPr>
-        <w:t xml:space="preserve">1.2 Introduction to Information Systems</w:t>
-      </w:r>
-    </w:p>
-    <w:p>
-      <w:pPr>
-        <w:spacing w:after="80"/>
-      </w:pPr>
-      <w:r>
-        <w:rPr>
-          <w:b w:val="false"/>
-          <w:bCs w:val="false"/>
-        </w:rPr>
-        <w:t xml:space="preserve">1.2.1 Information systems An information system (IS) is a set of interrelated components working together to collect, process, store, and disseminate information to potential users. An information system generates different types of information or reports that are used by employees in the organization to accomplish different organizational tasks. For example, managers use information to make decisions such as determining the selling price of a product. Information systems have now become an integral</w:t>
-      </w:r>
-    </w:p>
-    <w:p>
-      <w:pPr>
-        <w:spacing w:after="80"/>
-      </w:pPr>
-      <w:r>
-        <w:rPr>
-          <w:b w:val="false"/>
-          <w:bCs w:val="false"/>
-        </w:rPr>
-        <w:t xml:space="preserve">1.3 Applications of Information System</w:t>
-      </w:r>
-    </w:p>
-    <w:p>
-      <w:pPr>
-        <w:spacing w:after="80"/>
-      </w:pPr>
-      <w:r>
-        <w:rPr>
-          <w:b w:val="false"/>
-          <w:bCs w:val="false"/>
-        </w:rPr>
-        <w:t xml:space="preserve">Brainstorming 1.2  Share ideas on information systems that are used to provide services in the business environment. Information systems have now become the means through which different IT- enabled services are provided by organizations. These IT-enabled services are usually known as e-services. E-services are defined as the provision of public services using technology as a mode of service delivery. For example, banks</w:t>
-      </w:r>
-    </w:p>
-    <w:p>
-      <w:pPr>
-        <w:spacing w:after="80"/>
-      </w:pPr>
-      <w:r>
-        <w:rPr>
-          <w:b w:val="false"/>
-          <w:bCs w:val="false"/>
-        </w:rPr>
-        <w:t xml:space="preserve">1.4 IT for Entrepreneurship</w:t>
-      </w:r>
-    </w:p>
-    <w:p>
-      <w:pPr>
-        <w:spacing w:after="80"/>
-      </w:pPr>
-      <w:r>
-        <w:rPr>
-          <w:b w:val="false"/>
-          <w:bCs w:val="false"/>
-        </w:rPr>
-        <w:t xml:space="preserve">Entrepreneurship is defined as the process of designing, launching, and running a new business. An entrepreneur is an individual who creates a new business, bearing most of the risks and enjoying most of the rewards. The entrepreneur is commonly seen as an innovator, a source of new ideas, goods, services, and businesses. Information technology (IT) is transforming the world of work. IT provides new opportunities for business people. IT enabled business is a business that uses IT as a platform to run a business. It includes business like online training, providing</w:t>
+        <w:t xml:space="preserve">1.2. Introduction to Information Systems</w:t>
+      </w:r>
+    </w:p>
+    <w:p>
+      <w:pPr>
+        <w:spacing w:after="80"/>
+      </w:pPr>
+      <w:r>
+        <w:rPr>
+          <w:b w:val="false"/>
+          <w:bCs w:val="false"/>
+        </w:rPr>
+        <w:t xml:space="preserve">1.2.1 Information systems</w:t>
+      </w:r>
+    </w:p>
+    <w:p>
+      <w:pPr>
+        <w:spacing w:after="80"/>
+      </w:pPr>
+      <w:r>
+        <w:rPr>
+          <w:b w:val="false"/>
+          <w:bCs w:val="false"/>
+        </w:rPr>
+        <w:t xml:space="preserve">An information system (IS) is a set of interrelated components working together</w:t>
+      </w:r>
+    </w:p>
+    <w:p>
+      <w:pPr>
+        <w:spacing w:after="80"/>
+      </w:pPr>
+      <w:r>
+        <w:rPr>
+          <w:b w:val="false"/>
+          <w:bCs w:val="false"/>
+        </w:rPr>
+        <w:t xml:space="preserve">to collect, process, store, and disseminate information to potential users. An information system generates different types of information or reports that</w:t>
+      </w:r>
+    </w:p>
+    <w:p>
+      <w:pPr>
+        <w:spacing w:after="80"/>
+      </w:pPr>
+      <w:r>
+        <w:rPr>
+          <w:b w:val="false"/>
+          <w:bCs w:val="false"/>
+        </w:rPr>
+        <w:t xml:space="preserve">are used by employees in the organization to accomplish different organizational</w:t>
+      </w:r>
+    </w:p>
+    <w:p>
+      <w:pPr>
+        <w:spacing w:after="80"/>
+      </w:pPr>
+      <w:r>
+        <w:rPr>
+          <w:b w:val="false"/>
+          <w:bCs w:val="false"/>
+        </w:rPr>
+        <w:t xml:space="preserve">tasks. For example, managers use information to make decisions such as determining</w:t>
+      </w:r>
+    </w:p>
+    <w:p>
+      <w:pPr>
+        <w:spacing w:after="80"/>
+      </w:pPr>
+      <w:r>
+        <w:rPr>
+          <w:b w:val="false"/>
+          <w:bCs w:val="false"/>
+        </w:rPr>
+        <w:t xml:space="preserve">the selling price of a product. Information systems have now become an integral</w:t>
+      </w:r>
+    </w:p>
+    <w:p>
+      <w:pPr>
+        <w:spacing w:after="80"/>
+      </w:pPr>
+      <w:r>
+        <w:rPr>
+          <w:b w:val="false"/>
+          <w:bCs w:val="false"/>
+        </w:rPr>
+        <w:t xml:space="preserve">part of organizations. They are used to capture data and generate summarized</w:t>
+      </w:r>
+    </w:p>
+    <w:p>
+      <w:pPr>
+        <w:spacing w:after="80"/>
+      </w:pPr>
+      <w:r>
+        <w:rPr>
+          <w:b w:val="false"/>
+          <w:bCs w:val="false"/>
+        </w:rPr>
+        <w:t xml:space="preserve">reports for decision making. For example, a school information system captures</w:t>
+      </w:r>
+    </w:p>
+    <w:p>
+      <w:pPr>
+        <w:spacing w:after="80"/>
+      </w:pPr>
+      <w:r>
+        <w:rPr>
+          <w:b w:val="false"/>
+          <w:bCs w:val="false"/>
+        </w:rPr>
+        <w:t xml:space="preserve">student data about different types of assessments such as quizzes, assignments and</w:t>
+      </w:r>
+    </w:p>
+    <w:p>
+      <w:pPr>
+        <w:spacing w:after="80"/>
+      </w:pPr>
+      <w:r>
+        <w:rPr>
+          <w:b w:val="false"/>
+          <w:bCs w:val="false"/>
+        </w:rPr>
+        <w:t xml:space="preserve">final examinations. All these assessment data are summarized to show a student’s</w:t>
+      </w:r>
+    </w:p>
+    <w:p>
+      <w:pPr>
+        <w:spacing w:after="80"/>
+      </w:pPr>
+      <w:r>
+        <w:rPr>
+          <w:b w:val="false"/>
+          <w:bCs w:val="false"/>
+        </w:rPr>
+        <w:t xml:space="preserve">overall performance. Each subject’s mark is used to calculate the average mark of</w:t>
+      </w:r>
+    </w:p>
+    <w:p>
+      <w:pPr>
+        <w:spacing w:after="80"/>
+      </w:pPr>
+      <w:r>
+        <w:rPr>
+          <w:b w:val="false"/>
+          <w:bCs w:val="false"/>
+        </w:rPr>
+        <w:t xml:space="preserve">students and rank them accordingly. This information is important for schools to</w:t>
+      </w:r>
+    </w:p>
+    <w:p>
+      <w:pPr>
+        <w:spacing w:after="80"/>
+      </w:pPr>
+      <w:r>
+        <w:rPr>
+          <w:b w:val="false"/>
+          <w:bCs w:val="false"/>
+        </w:rPr>
+        <w:t xml:space="preserve">effectively organize their regular activities.</w:t>
+      </w:r>
+    </w:p>
+    <w:p>
+      <w:pPr>
+        <w:spacing w:after="80"/>
+      </w:pPr>
+      <w:r>
+        <w:rPr>
+          <w:b w:val="false"/>
+          <w:bCs w:val="false"/>
+        </w:rPr>
+        <w:t xml:space="preserve">I NFORMATION TECHNOLOGY GRADE 11 ~ STUDENT TEXTBOOK 7</w:t>
+      </w:r>
+    </w:p>
+    <w:p>
+      <w:pPr>
+        <w:spacing w:after="80"/>
+      </w:pPr>
+      <w:r>
+        <w:rPr>
+          <w:b w:val="false"/>
+          <w:bCs w:val="false"/>
+        </w:rPr>
+        <w:t xml:space="preserve">Activity 1.4</w:t>
+      </w:r>
+    </w:p>
+    <w:p>
+      <w:pPr>
+        <w:spacing w:after="80"/>
+      </w:pPr>
+      <w:r>
+        <w:rPr>
+          <w:b w:val="false"/>
+          <w:bCs w:val="false"/>
+        </w:rPr>
+        <w:t xml:space="preserve">1. Discuss the data captured by your school’s information system.</w:t>
+      </w:r>
+    </w:p>
+    <w:p>
+      <w:pPr>
+        <w:spacing w:after="80"/>
+      </w:pPr>
+      <w:r>
+        <w:rPr>
+          <w:b w:val="false"/>
+          <w:bCs w:val="false"/>
+        </w:rPr>
+        <w:t xml:space="preserve">2. Discuss the information that is generated by your school’s information</w:t>
+      </w:r>
+    </w:p>
+    <w:p>
+      <w:pPr>
+        <w:spacing w:after="80"/>
+      </w:pPr>
+      <w:r>
+        <w:rPr>
+          <w:b w:val="false"/>
+          <w:bCs w:val="false"/>
+        </w:rPr>
+        <w:t xml:space="preserve">system and for what purpose it is used.</w:t>
+      </w:r>
+    </w:p>
+    <w:p>
+      <w:pPr>
+        <w:spacing w:after="80"/>
+      </w:pPr>
+      <w:r>
+        <w:rPr>
+          <w:b w:val="false"/>
+          <w:bCs w:val="false"/>
+        </w:rPr>
+        <w:t xml:space="preserve">1.2.2 Components of IS</w:t>
+      </w:r>
+    </w:p>
+    <w:p>
+      <w:pPr>
+        <w:spacing w:after="80"/>
+      </w:pPr>
+      <w:r>
+        <w:rPr>
+          <w:b w:val="false"/>
+          <w:bCs w:val="false"/>
+        </w:rPr>
+        <w:t xml:space="preserve">Information systems can be viewed as having five major components: hardware,</w:t>
+      </w:r>
+    </w:p>
+    <w:p>
+      <w:pPr>
+        <w:spacing w:after="80"/>
+      </w:pPr>
+      <w:r>
+        <w:rPr>
+          <w:b w:val="false"/>
+          <w:bCs w:val="false"/>
+        </w:rPr>
+        <w:t xml:space="preserve">software, data/information, people, and procedure. The functions of each component</w:t>
+      </w:r>
+    </w:p>
+    <w:p>
+      <w:pPr>
+        <w:spacing w:after="80"/>
+      </w:pPr>
+      <w:r>
+        <w:rPr>
+          <w:b w:val="false"/>
+          <w:bCs w:val="false"/>
+        </w:rPr>
+        <w:t xml:space="preserve">are explained below.</w:t>
+      </w:r>
+    </w:p>
+    <w:p>
+      <w:pPr>
+        <w:spacing w:after="80"/>
+      </w:pPr>
+      <w:r>
+        <w:rPr>
+          <w:b w:val="false"/>
+          <w:bCs w:val="false"/>
+        </w:rPr>
+        <w:t xml:space="preserve">• Hardware</w:t>
+      </w:r>
+    </w:p>
+    <w:p>
+      <w:pPr>
+        <w:spacing w:after="80"/>
+      </w:pPr>
+      <w:r>
+        <w:rPr>
+          <w:b w:val="false"/>
+          <w:bCs w:val="false"/>
+        </w:rPr>
+        <w:t xml:space="preserve">Hardware includes digital devices that are required to perform core information</w:t>
+      </w:r>
+    </w:p>
+    <w:p>
+      <w:pPr>
+        <w:spacing w:after="80"/>
+      </w:pPr>
+      <w:r>
+        <w:rPr>
+          <w:b w:val="false"/>
+          <w:bCs w:val="false"/>
+        </w:rPr>
+        <w:t xml:space="preserve">system functions such as data storage, data processing, and communication (see</w:t>
+      </w:r>
+    </w:p>
+    <w:p>
+      <w:pPr>
+        <w:spacing w:after="80"/>
+      </w:pPr>
+      <w:r>
+        <w:rPr>
+          <w:b w:val="false"/>
+          <w:bCs w:val="false"/>
+        </w:rPr>
+        <w:t xml:space="preserve">I NFORMATION TECHNOLOGY GRADE 11 ~ STUDENT TEXTBOOK 8</w:t>
+      </w:r>
+    </w:p>
+    <w:p>
+      <w:pPr>
+        <w:spacing w:after="80"/>
+      </w:pPr>
+      <w:r>
+        <w:rPr>
+          <w:b w:val="false"/>
+          <w:bCs w:val="false"/>
+        </w:rPr>
+        <w:t xml:space="preserve">Communication among disparate parts of an information systems is facilitated</w:t>
+      </w:r>
+    </w:p>
+    <w:p>
+      <w:pPr>
+        <w:spacing w:after="80"/>
+      </w:pPr>
+      <w:r>
+        <w:rPr>
+          <w:b w:val="false"/>
+          <w:bCs w:val="false"/>
+        </w:rPr>
+        <w:t xml:space="preserve">through telecommunication networks that include wired and wireless networks.</w:t>
+      </w:r>
+    </w:p>
+    <w:p>
+      <w:pPr>
+        <w:spacing w:after="80"/>
+      </w:pPr>
+      <w:r>
+        <w:rPr>
+          <w:b w:val="false"/>
+          <w:bCs w:val="false"/>
+        </w:rPr>
+        <w:t xml:space="preserve">• Software</w:t>
+      </w:r>
+    </w:p>
+    <w:p>
+      <w:pPr>
+        <w:spacing w:after="80"/>
+      </w:pPr>
+      <w:r>
+        <w:rPr>
+          <w:b w:val="false"/>
+          <w:bCs w:val="false"/>
+        </w:rPr>
+        <w:t xml:space="preserve">Software is a set of instructions that commands the computer hardware to do</w:t>
+      </w:r>
+    </w:p>
+    <w:p>
+      <w:pPr>
+        <w:spacing w:after="80"/>
+      </w:pPr>
+      <w:r>
+        <w:rPr>
+          <w:b w:val="false"/>
+          <w:bCs w:val="false"/>
+        </w:rPr>
+        <w:t xml:space="preserve">something. It includes the operating system, the Database Management System</w:t>
+      </w:r>
+    </w:p>
+    <w:p>
+      <w:pPr>
+        <w:spacing w:after="80"/>
+      </w:pPr>
+      <w:r>
+        <w:rPr>
+          <w:b w:val="false"/>
+          <w:bCs w:val="false"/>
+        </w:rPr>
+        <w:t xml:space="preserve">(DBMS), application software, anti-virus software, and others that are required to</w:t>
+      </w:r>
+    </w:p>
+    <w:p>
+      <w:pPr>
+        <w:spacing w:after="80"/>
+      </w:pPr>
+      <w:r>
+        <w:rPr>
+          <w:b w:val="false"/>
+          <w:bCs w:val="false"/>
+        </w:rPr>
+        <w:t xml:space="preserve">be in place for the information system to operate properly.</w:t>
+      </w:r>
+    </w:p>
+    <w:p>
+      <w:pPr>
+        <w:spacing w:after="80"/>
+      </w:pPr>
+      <w:r>
+        <w:rPr>
+          <w:b w:val="false"/>
+          <w:bCs w:val="false"/>
+        </w:rPr>
+        <w:t xml:space="preserve">• Data and Information</w:t>
+      </w:r>
+    </w:p>
+    <w:p>
+      <w:pPr>
+        <w:spacing w:after="80"/>
+      </w:pPr>
+      <w:r>
+        <w:rPr>
+          <w:b w:val="false"/>
+          <w:bCs w:val="false"/>
+        </w:rPr>
+        <w:t xml:space="preserve">Organizations generate different types of data when they interact with their</w:t>
+      </w:r>
+    </w:p>
+    <w:p>
+      <w:pPr>
+        <w:spacing w:after="80"/>
+      </w:pPr>
+      <w:r>
+        <w:rPr>
+          <w:b w:val="false"/>
+          <w:bCs w:val="false"/>
+        </w:rPr>
+        <w:t xml:space="preserve">customers and suppliers. For example, data is generated when a digital device</w:t>
+      </w:r>
+    </w:p>
+    <w:p>
+      <w:pPr>
+        <w:spacing w:after="80"/>
+      </w:pPr>
+      <w:r>
+        <w:rPr>
+          <w:b w:val="false"/>
+          <w:bCs w:val="false"/>
+        </w:rPr>
+        <w:t xml:space="preserve">selling company sells its products such as computers and printers. The company</w:t>
+      </w:r>
+    </w:p>
+    <w:p>
+      <w:pPr>
+        <w:spacing w:after="80"/>
+      </w:pPr>
+      <w:r>
+        <w:rPr>
+          <w:b w:val="false"/>
+          <w:bCs w:val="false"/>
+        </w:rPr>
+        <w:t xml:space="preserve">must keep track of its daily sales data. Without such data, the company cannot</w:t>
+      </w:r>
+    </w:p>
+    <w:p>
+      <w:pPr>
+        <w:spacing w:after="80"/>
+      </w:pPr>
+      <w:r>
+        <w:rPr>
+          <w:b w:val="false"/>
+          <w:bCs w:val="false"/>
+        </w:rPr>
+        <w:t xml:space="preserve">properly execute its tasks and monitor its performance.</w:t>
+      </w:r>
+    </w:p>
+    <w:p>
+      <w:pPr>
+        <w:spacing w:after="80"/>
+      </w:pPr>
+      <w:r>
+        <w:rPr>
+          <w:b w:val="false"/>
+          <w:bCs w:val="false"/>
+        </w:rPr>
+        <w:t xml:space="preserve">The various types of data that organizations collect on a regular basis must be</w:t>
+      </w:r>
+    </w:p>
+    <w:p>
+      <w:pPr>
+        <w:spacing w:after="80"/>
+      </w:pPr>
+      <w:r>
+        <w:rPr>
+          <w:b w:val="false"/>
+          <w:bCs w:val="false"/>
+        </w:rPr>
+        <w:t xml:space="preserve">stored in a computer database for later use. The data is used to prepare reports such</w:t>
+      </w:r>
+    </w:p>
+    <w:p>
+      <w:pPr>
+        <w:spacing w:after="80"/>
+      </w:pPr>
+      <w:r>
+        <w:rPr>
+          <w:b w:val="false"/>
+          <w:bCs w:val="false"/>
+        </w:rPr>
+        <w:t xml:space="preserve">as monthly sales reports that are used by managers for decision making. Therefore,</w:t>
+      </w:r>
+    </w:p>
+    <w:p>
+      <w:pPr>
+        <w:spacing w:after="80"/>
+      </w:pPr>
+      <w:r>
+        <w:rPr>
+          <w:b w:val="false"/>
+          <w:bCs w:val="false"/>
+        </w:rPr>
+        <w:t xml:space="preserve">data or information is a critical resource or asset that must be properly managed by</w:t>
+      </w:r>
+    </w:p>
+    <w:p>
+      <w:pPr>
+        <w:spacing w:after="80"/>
+      </w:pPr>
+      <w:r>
+        <w:rPr>
+          <w:b w:val="false"/>
+          <w:bCs w:val="false"/>
+        </w:rPr>
+        <w:t xml:space="preserve">the information system.</w:t>
+      </w:r>
+    </w:p>
+    <w:p>
+      <w:pPr>
+        <w:spacing w:after="80"/>
+      </w:pPr>
+      <w:r>
+        <w:rPr>
+          <w:b w:val="false"/>
+          <w:bCs w:val="false"/>
+        </w:rPr>
+        <w:t xml:space="preserve">I NFORMATION TECHNOLOGY GRADE 11 ~ STUDENT TEXTBOOK 9</w:t>
+      </w:r>
+    </w:p>
+    <w:p>
+      <w:pPr>
+        <w:spacing w:after="80"/>
+      </w:pPr>
+      <w:r>
+        <w:rPr>
+          <w:b w:val="false"/>
+          <w:bCs w:val="false"/>
+        </w:rPr>
+        <w:t xml:space="preserve">Links</w:t>
+      </w:r>
+    </w:p>
+    <w:p>
+      <w:pPr>
+        <w:spacing w:after="80"/>
+      </w:pPr>
+      <w:r>
+        <w:rPr>
+          <w:b w:val="false"/>
+          <w:bCs w:val="false"/>
+        </w:rPr>
+        <w:t xml:space="preserve">See Section 1.1.1 of this unit for a more detailed explanation of data and</w:t>
+      </w:r>
+    </w:p>
+    <w:p>
+      <w:pPr>
+        <w:spacing w:after="80"/>
+      </w:pPr>
+      <w:r>
+        <w:rPr>
+          <w:b w:val="false"/>
+          <w:bCs w:val="false"/>
+        </w:rPr>
+        <w:t xml:space="preserve">information.</w:t>
+      </w:r>
+    </w:p>
+    <w:p>
+      <w:pPr>
+        <w:spacing w:after="80"/>
+      </w:pPr>
+      <w:r>
+        <w:rPr>
+          <w:b w:val="false"/>
+          <w:bCs w:val="false"/>
+        </w:rPr>
+        <w:t xml:space="preserve">• People</w:t>
+      </w:r>
+    </w:p>
+    <w:p>
+      <w:pPr>
+        <w:spacing w:after="80"/>
+      </w:pPr>
+      <w:r>
+        <w:rPr>
+          <w:b w:val="false"/>
+          <w:bCs w:val="false"/>
+        </w:rPr>
+        <w:t xml:space="preserve">Information systems require qualified or trained people with knowledge to</w:t>
+      </w:r>
+    </w:p>
+    <w:p>
+      <w:pPr>
+        <w:spacing w:after="80"/>
+      </w:pPr>
+      <w:r>
+        <w:rPr>
+          <w:b w:val="false"/>
+          <w:bCs w:val="false"/>
+        </w:rPr>
+        <w:t xml:space="preserve">operate the technologies and identify new data that must be captured and stored</w:t>
+      </w:r>
+    </w:p>
+    <w:p>
+      <w:pPr>
+        <w:spacing w:after="80"/>
+      </w:pPr>
+      <w:r>
+        <w:rPr>
+          <w:b w:val="false"/>
+          <w:bCs w:val="false"/>
+        </w:rPr>
+        <w:t xml:space="preserve">by the information system. Therefore, the technical people who have specialized</w:t>
+      </w:r>
+    </w:p>
+    <w:p>
+      <w:pPr>
+        <w:spacing w:after="80"/>
+      </w:pPr>
+      <w:r>
+        <w:rPr>
+          <w:b w:val="false"/>
+          <w:bCs w:val="false"/>
+        </w:rPr>
+        <w:t xml:space="preserve">knowledge of the information system are integral parts of the information system of</w:t>
+      </w:r>
+    </w:p>
+    <w:p>
+      <w:pPr>
+        <w:spacing w:after="80"/>
+      </w:pPr>
+      <w:r>
+        <w:rPr>
+          <w:b w:val="false"/>
+          <w:bCs w:val="false"/>
+        </w:rPr>
+        <w:t xml:space="preserve">an organization. They are responsible to create and manage an information system</w:t>
+      </w:r>
+    </w:p>
+    <w:p>
+      <w:pPr>
+        <w:spacing w:after="80"/>
+      </w:pPr>
+      <w:r>
+        <w:rPr>
+          <w:b w:val="false"/>
+          <w:bCs w:val="false"/>
+        </w:rPr>
+        <w:t xml:space="preserve">that is supportive to the organization’s daily activities.</w:t>
+      </w:r>
+    </w:p>
+    <w:p>
+      <w:pPr>
+        <w:spacing w:after="80"/>
+      </w:pPr>
+      <w:r>
+        <w:rPr>
+          <w:b w:val="false"/>
+          <w:bCs w:val="false"/>
+        </w:rPr>
+        <w:t xml:space="preserve">• Procedure</w:t>
+      </w:r>
+    </w:p>
+    <w:p>
+      <w:pPr>
+        <w:spacing w:after="80"/>
+      </w:pPr>
+      <w:r>
+        <w:rPr>
+          <w:b w:val="false"/>
+          <w:bCs w:val="false"/>
+        </w:rPr>
+        <w:t xml:space="preserve">Procedure is another component of information systems. A procedure is a series of</w:t>
+      </w:r>
+    </w:p>
+    <w:p>
+      <w:pPr>
+        <w:spacing w:after="80"/>
+      </w:pPr>
+      <w:r>
+        <w:rPr>
+          <w:b w:val="false"/>
+          <w:bCs w:val="false"/>
+        </w:rPr>
+        <w:t xml:space="preserve">steps followed to achieve a desired outcome or goal. Procedures are the policies</w:t>
+      </w:r>
+    </w:p>
+    <w:p>
+      <w:pPr>
+        <w:spacing w:after="80"/>
+      </w:pPr>
+      <w:r>
+        <w:rPr>
+          <w:b w:val="false"/>
+          <w:bCs w:val="false"/>
+        </w:rPr>
+        <w:t xml:space="preserve">and methods to be followed in using, operating, and maintaining an information</w:t>
+      </w:r>
+    </w:p>
+    <w:p>
+      <w:pPr>
+        <w:spacing w:after="80"/>
+      </w:pPr>
+      <w:r>
+        <w:rPr>
+          <w:b w:val="false"/>
+          <w:bCs w:val="false"/>
+        </w:rPr>
+        <w:t xml:space="preserve">system. It is necessary for organizations to have clear procedures that clarify: what</w:t>
+      </w:r>
+    </w:p>
+    <w:p>
+      <w:pPr>
+        <w:spacing w:after="80"/>
+      </w:pPr>
+      <w:r>
+        <w:rPr>
+          <w:b w:val="false"/>
+          <w:bCs w:val="false"/>
+        </w:rPr>
+        <w:t xml:space="preserve">data should be captured by the information system; who should have access to the</w:t>
+      </w:r>
+    </w:p>
+    <w:p>
+      <w:pPr>
+        <w:spacing w:after="80"/>
+      </w:pPr>
+      <w:r>
+        <w:rPr>
+          <w:b w:val="false"/>
+          <w:bCs w:val="false"/>
+        </w:rPr>
+        <w:t xml:space="preserve">data; who should have the privilege to modify data; and many more. Procedures</w:t>
+      </w:r>
+    </w:p>
+    <w:p>
+      <w:pPr>
+        <w:spacing w:after="80"/>
+      </w:pPr>
+      <w:r>
+        <w:rPr>
+          <w:b w:val="false"/>
+          <w:bCs w:val="false"/>
+        </w:rPr>
+        <w:t xml:space="preserve">that are put in place to facilitate an effective use, operation, and maintenance</w:t>
+      </w:r>
+    </w:p>
+    <w:p>
+      <w:pPr>
+        <w:spacing w:after="80"/>
+      </w:pPr>
+      <w:r>
+        <w:rPr>
+          <w:b w:val="false"/>
+          <w:bCs w:val="false"/>
+        </w:rPr>
+        <w:t xml:space="preserve">of information systems will help organizations to get more benefits from their</w:t>
+      </w:r>
+    </w:p>
+    <w:p>
+      <w:pPr>
+        <w:spacing w:after="80"/>
+      </w:pPr>
+      <w:r>
+        <w:rPr>
+          <w:b w:val="false"/>
+          <w:bCs w:val="false"/>
+        </w:rPr>
+        <w:t xml:space="preserve">information systems.</w:t>
+      </w:r>
+    </w:p>
+    <w:p>
+      <w:pPr>
+        <w:spacing w:after="80"/>
+      </w:pPr>
+      <w:r>
+        <w:rPr>
+          <w:b w:val="false"/>
+          <w:bCs w:val="false"/>
+        </w:rPr>
+        <w:t xml:space="preserve">Activity 1.5</w:t>
+      </w:r>
+    </w:p>
+    <w:p>
+      <w:pPr>
+        <w:spacing w:after="80"/>
+      </w:pPr>
+      <w:r>
+        <w:rPr>
+          <w:b w:val="false"/>
+          <w:bCs w:val="false"/>
+        </w:rPr>
+        <w:t xml:space="preserve">• Explain the function of each component of an information system.</w:t>
+      </w:r>
+    </w:p>
+    <w:p>
+      <w:pPr>
+        <w:spacing w:after="80"/>
+      </w:pPr>
+      <w:r>
+        <w:rPr>
+          <w:b w:val="false"/>
+          <w:bCs w:val="false"/>
+        </w:rPr>
+        <w:t xml:space="preserve">In the following section, we will discuss a human resource information system</w:t>
+      </w:r>
+    </w:p>
+    <w:p>
+      <w:pPr>
+        <w:spacing w:after="80"/>
+      </w:pPr>
+      <w:r>
+        <w:rPr>
+          <w:b w:val="false"/>
+          <w:bCs w:val="false"/>
+        </w:rPr>
+        <w:t xml:space="preserve">(HRIS) as an example of information system implementation in an organization.</w:t>
+      </w:r>
+    </w:p>
+    <w:p>
+      <w:pPr>
+        <w:spacing w:after="80"/>
+      </w:pPr>
+      <w:r>
+        <w:rPr>
+          <w:b w:val="false"/>
+          <w:bCs w:val="false"/>
+        </w:rPr>
+        <w:t xml:space="preserve">HRIS is a type of information system. HRIS has a database that stores data of</w:t>
+      </w:r>
+    </w:p>
+    <w:p>
+      <w:pPr>
+        <w:spacing w:after="80"/>
+      </w:pPr>
+      <w:r>
+        <w:rPr>
+          <w:b w:val="false"/>
+          <w:bCs w:val="false"/>
+        </w:rPr>
+        <w:t xml:space="preserve">employees. The kind of data kept in a database of typical HRIS include:</w:t>
+      </w:r>
+    </w:p>
+    <w:p>
+      <w:pPr>
+        <w:spacing w:after="80"/>
+      </w:pPr>
+      <w:r>
+        <w:rPr>
+          <w:b w:val="false"/>
+          <w:bCs w:val="false"/>
+        </w:rPr>
+        <w:t xml:space="preserve">• Recruitment data such as applicant’s Curriculum Vitae and the number of</w:t>
+      </w:r>
+    </w:p>
+    <w:p>
+      <w:pPr>
+        <w:spacing w:after="80"/>
+      </w:pPr>
+      <w:r>
+        <w:rPr>
+          <w:b w:val="false"/>
+          <w:bCs w:val="false"/>
+        </w:rPr>
+        <w:t xml:space="preserve">candidates.</w:t>
+      </w:r>
+    </w:p>
+    <w:p>
+      <w:pPr>
+        <w:spacing w:after="80"/>
+      </w:pPr>
+      <w:r>
+        <w:rPr>
+          <w:b w:val="false"/>
+          <w:bCs w:val="false"/>
+        </w:rPr>
+        <w:t xml:space="preserve">I NFORMATION TECHNOLOGY GRADE 11 ~ STUDENT TEXTBOOK 10</w:t>
+      </w:r>
+    </w:p>
+    <w:p>
+      <w:pPr>
+        <w:spacing w:after="80"/>
+      </w:pPr>
+      <w:r>
+        <w:rPr>
+          <w:b w:val="false"/>
+          <w:bCs w:val="false"/>
+        </w:rPr>
+        <w:t xml:space="preserve">• demographic data like employee ID, name, date of birth, gender, position,</w:t>
+      </w:r>
+    </w:p>
+    <w:p>
+      <w:pPr>
+        <w:spacing w:after="80"/>
+      </w:pPr>
+      <w:r>
+        <w:rPr>
+          <w:b w:val="false"/>
+          <w:bCs w:val="false"/>
+        </w:rPr>
+        <w:t xml:space="preserve">residence, cost center specifications, department, termination date, and so</w:t>
+      </w:r>
+    </w:p>
+    <w:p>
+      <w:pPr>
+        <w:spacing w:after="80"/>
+      </w:pPr>
+      <w:r>
+        <w:rPr>
+          <w:b w:val="false"/>
+          <w:bCs w:val="false"/>
+        </w:rPr>
+        <w:t xml:space="preserve">on.</w:t>
+      </w:r>
+    </w:p>
+    <w:p>
+      <w:pPr>
+        <w:spacing w:after="80"/>
+      </w:pPr>
+      <w:r>
+        <w:rPr>
+          <w:b w:val="false"/>
+          <w:bCs w:val="false"/>
+        </w:rPr>
+        <w:t xml:space="preserve">• performance management data like performance records of employees. It</w:t>
+      </w:r>
+    </w:p>
+    <w:p>
+      <w:pPr>
+        <w:spacing w:after="80"/>
+      </w:pPr>
+      <w:r>
+        <w:rPr>
+          <w:b w:val="false"/>
+          <w:bCs w:val="false"/>
+        </w:rPr>
+        <w:t xml:space="preserve">refers to the feedback, ratings, and achievements of employees.</w:t>
+      </w:r>
+    </w:p>
+    <w:p>
+      <w:pPr>
+        <w:spacing w:after="80"/>
+      </w:pPr>
+      <w:r>
+        <w:rPr>
+          <w:b w:val="false"/>
+          <w:bCs w:val="false"/>
+        </w:rPr>
+        <w:t xml:space="preserve">• learning management data like training and development.</w:t>
+      </w:r>
+    </w:p>
+    <w:p>
+      <w:pPr>
+        <w:spacing w:after="80"/>
+      </w:pPr>
+      <w:r>
+        <w:rPr>
+          <w:b w:val="false"/>
+          <w:bCs w:val="false"/>
+        </w:rPr>
+        <w:t xml:space="preserve">• Compensation and benefits data like employee’s salary structure and other</w:t>
+      </w:r>
+    </w:p>
+    <w:p>
+      <w:pPr>
+        <w:spacing w:after="80"/>
+      </w:pPr>
+      <w:r>
+        <w:rPr>
+          <w:b w:val="false"/>
+          <w:bCs w:val="false"/>
+        </w:rPr>
+        <w:t xml:space="preserve">benefits.</w:t>
+      </w:r>
+    </w:p>
+    <w:p>
+      <w:pPr>
+        <w:spacing w:after="80"/>
+      </w:pPr>
+      <w:r>
+        <w:rPr>
+          <w:b w:val="false"/>
+          <w:bCs w:val="false"/>
+        </w:rPr>
+        <w:t xml:space="preserve">HRIS uses different technologies to store and process data into useful information.</w:t>
+      </w:r>
+    </w:p>
+    <w:p>
+      <w:pPr>
+        <w:spacing w:after="80"/>
+      </w:pPr>
+      <w:r>
+        <w:rPr>
+          <w:b w:val="false"/>
+          <w:bCs w:val="false"/>
+        </w:rPr>
+        <w:t xml:space="preserve">Server computer, desktop computer, laptop, and networks to interconnect different</w:t>
+      </w:r>
+    </w:p>
+    <w:p>
+      <w:pPr>
+        <w:spacing w:after="80"/>
+      </w:pPr>
+      <w:r>
+        <w:rPr>
+          <w:b w:val="false"/>
+          <w:bCs w:val="false"/>
+        </w:rPr>
+        <w:t xml:space="preserve">departments and branches are among the infrastructural resources used in a HRIS.</w:t>
+      </w:r>
+    </w:p>
+    <w:p>
+      <w:pPr>
+        <w:spacing w:after="80"/>
+      </w:pPr>
+      <w:r>
+        <w:rPr>
+          <w:b w:val="false"/>
+          <w:bCs w:val="false"/>
+        </w:rPr>
+        <w:t xml:space="preserve">Employee use the available computers to access data and generate information</w:t>
+      </w:r>
+    </w:p>
+    <w:p>
+      <w:pPr>
+        <w:spacing w:after="80"/>
+      </w:pPr>
+      <w:r>
+        <w:rPr>
+          <w:b w:val="false"/>
+          <w:bCs w:val="false"/>
+        </w:rPr>
+        <w:t xml:space="preserve">from the database.</w:t>
+      </w:r>
+    </w:p>
+    <w:p>
+      <w:pPr>
+        <w:spacing w:after="80"/>
+      </w:pPr>
+      <w:r>
+        <w:rPr>
+          <w:b w:val="false"/>
+          <w:bCs w:val="false"/>
+        </w:rPr>
+        <w:t xml:space="preserve">Some of the software components of the HRIS would include:</w:t>
+      </w:r>
+    </w:p>
+    <w:p>
+      <w:pPr>
+        <w:spacing w:after="80"/>
+      </w:pPr>
+      <w:r>
+        <w:rPr>
+          <w:b w:val="false"/>
+          <w:bCs w:val="false"/>
+        </w:rPr>
+        <w:t xml:space="preserve">• Recruitment software. This software is used to automate the posting of</w:t>
+      </w:r>
+    </w:p>
+    <w:p>
+      <w:pPr>
+        <w:spacing w:after="80"/>
+      </w:pPr>
+      <w:r>
+        <w:rPr>
+          <w:b w:val="false"/>
+          <w:bCs w:val="false"/>
+        </w:rPr>
+        <w:t xml:space="preserve">job offerings as well as the sorting of incoming applications. The software</w:t>
+      </w:r>
+    </w:p>
+    <w:p>
+      <w:pPr>
+        <w:spacing w:after="80"/>
+      </w:pPr>
+      <w:r>
+        <w:rPr>
+          <w:b w:val="false"/>
+          <w:bCs w:val="false"/>
+        </w:rPr>
+        <w:t xml:space="preserve">I NFORMATION TECHNOLOGY GRADE 11 ~ STUDENT TEXTBOOK 11</w:t>
+      </w:r>
+    </w:p>
+    <w:p>
+      <w:pPr>
+        <w:spacing w:after="80"/>
+      </w:pPr>
+      <w:r>
+        <w:rPr>
+          <w:b w:val="false"/>
+          <w:bCs w:val="false"/>
+        </w:rPr>
+        <w:t xml:space="preserve">can post an organization’s job needs on a variety of websites. Applicants</w:t>
+      </w:r>
+    </w:p>
+    <w:p>
+      <w:pPr>
+        <w:spacing w:after="80"/>
+      </w:pPr>
+      <w:r>
+        <w:rPr>
+          <w:b w:val="false"/>
+          <w:bCs w:val="false"/>
+        </w:rPr>
+        <w:t xml:space="preserve">can also submit resumes without meeting with anyone in person.</w:t>
+      </w:r>
+    </w:p>
+    <w:p>
+      <w:pPr>
+        <w:spacing w:after="80"/>
+      </w:pPr>
+      <w:r>
+        <w:rPr>
+          <w:b w:val="false"/>
+          <w:bCs w:val="false"/>
+        </w:rPr>
+        <w:t xml:space="preserve">• Time and attendance software: It is used to track employee attendance.</w:t>
+      </w:r>
+    </w:p>
+    <w:p>
+      <w:pPr>
+        <w:spacing w:after="80"/>
+      </w:pPr>
+      <w:r>
+        <w:rPr>
+          <w:b w:val="false"/>
+          <w:bCs w:val="false"/>
+        </w:rPr>
+        <w:t xml:space="preserve">This software helps the organization save money. Employees are paid</w:t>
+      </w:r>
+    </w:p>
+    <w:p>
+      <w:pPr>
+        <w:spacing w:after="80"/>
+      </w:pPr>
+      <w:r>
+        <w:rPr>
+          <w:b w:val="false"/>
+          <w:bCs w:val="false"/>
+        </w:rPr>
+        <w:t xml:space="preserve">based on the hours they work.</w:t>
+      </w:r>
+    </w:p>
+    <w:p>
+      <w:pPr>
+        <w:spacing w:after="80"/>
+      </w:pPr>
+      <w:r>
+        <w:rPr>
+          <w:b w:val="false"/>
+          <w:bCs w:val="false"/>
+        </w:rPr>
+        <w:t xml:space="preserve">• Performance management software: It is used to manage performance</w:t>
+      </w:r>
+    </w:p>
+    <w:p>
+      <w:pPr>
+        <w:spacing w:after="80"/>
+      </w:pPr>
+      <w:r>
+        <w:rPr>
+          <w:b w:val="false"/>
+          <w:bCs w:val="false"/>
+        </w:rPr>
+        <w:t xml:space="preserve">appraisal data. It helps the organization to make evidence-based decisions</w:t>
+      </w:r>
+    </w:p>
+    <w:p>
+      <w:pPr>
+        <w:spacing w:after="80"/>
+      </w:pPr>
+      <w:r>
+        <w:rPr>
+          <w:b w:val="false"/>
+          <w:bCs w:val="false"/>
+        </w:rPr>
+        <w:t xml:space="preserve">to retain, promote, transfer, or terminate an employee.</w:t>
+      </w:r>
+    </w:p>
+    <w:p>
+      <w:pPr>
+        <w:spacing w:after="80"/>
+      </w:pPr>
+      <w:r>
+        <w:rPr>
+          <w:b w:val="false"/>
+          <w:bCs w:val="false"/>
+        </w:rPr>
+        <w:t xml:space="preserve">• Training and development software: This software is used to manage</w:t>
+      </w:r>
+    </w:p>
+    <w:p>
+      <w:pPr>
+        <w:spacing w:after="80"/>
+      </w:pPr>
+      <w:r>
+        <w:rPr>
+          <w:b w:val="false"/>
+          <w:bCs w:val="false"/>
+        </w:rPr>
+        <w:t xml:space="preserve">training programs for employees. It is also used to automate training for</w:t>
+      </w:r>
+    </w:p>
+    <w:p>
+      <w:pPr>
+        <w:spacing w:after="80"/>
+      </w:pPr>
+      <w:r>
+        <w:rPr>
+          <w:b w:val="false"/>
+          <w:bCs w:val="false"/>
+        </w:rPr>
+        <w:t xml:space="preserve">online delivery.</w:t>
+      </w:r>
+    </w:p>
+    <w:p>
+      <w:pPr>
+        <w:spacing w:after="80"/>
+      </w:pPr>
+      <w:r>
+        <w:rPr>
+          <w:b w:val="false"/>
+          <w:bCs w:val="false"/>
+        </w:rPr>
+        <w:t xml:space="preserve">Nowadays, information systems are no more considered only as means of</w:t>
+      </w:r>
+    </w:p>
+    <w:p>
+      <w:pPr>
+        <w:spacing w:after="80"/>
+      </w:pPr>
+      <w:r>
+        <w:rPr>
+          <w:b w:val="false"/>
+          <w:bCs w:val="false"/>
+        </w:rPr>
+        <w:t xml:space="preserve">generating information for managerial decision makings. Their role for the</w:t>
+      </w:r>
+    </w:p>
+    <w:p>
+      <w:pPr>
+        <w:spacing w:after="80"/>
+      </w:pPr>
+      <w:r>
+        <w:rPr>
+          <w:b w:val="false"/>
+          <w:bCs w:val="false"/>
+        </w:rPr>
+        <w:t xml:space="preserve">competitive power of organizations has become so high that they are considered</w:t>
+      </w:r>
+    </w:p>
+    <w:p>
+      <w:pPr>
+        <w:spacing w:after="80"/>
+      </w:pPr>
+      <w:r>
+        <w:rPr>
+          <w:b w:val="false"/>
+          <w:bCs w:val="false"/>
+        </w:rPr>
+        <w:t xml:space="preserve">as strategic assets of organizations.</w:t>
       </w:r>
     </w:p>
     <w:sectPr>

</xml_diff>